<commit_message>
actualizacion de version y puesta en produccion de RQM de proveedor en Inventario de Alarma de Cantidad Minima
</commit_message>
<xml_diff>
--- a/documentos/RQM Historico de Precios y Proveedor en Inventario de Minimos/MANUAL FUNCIONAL - Inventario del Articulo en Alarma de Cantidades Minimas.docx
+++ b/documentos/RQM Historico de Precios y Proveedor en Inventario de Minimos/MANUAL FUNCIONAL - Inventario del Articulo en Alarma de Cantidades Minimas.docx
@@ -150,7 +150,7 @@
           <w:sz w:val="28"/>
           <w:szCs w:val="28"/>
         </w:rPr>
-        <w:t xml:space="preserve">Versión 1.1: última compra confirmada (Proveedor en Inventario de Mínimos)</w:t>
+        <w:t>Versión 1.1: última compra confirmada (Proveedor en Inventario de Mínimos)</w:t>
       </w:r>
     </w:p>
     <w:p>
@@ -228,6 +228,8 @@
           <w:szCs w:val="52"/>
         </w:rPr>
       </w:pPr>
+      <w:bookmarkStart w:id="0" w:name="_GoBack"/>
+      <w:bookmarkEnd w:id="0"/>
     </w:p>
     <w:p>
       <w:pPr>
@@ -244,16 +246,6 @@
         <w:jc w:val="center"/>
         <w:rPr>
           <w:rFonts w:ascii="Century Gothic" w:hAnsi="Century Gothic" w:cstheme="majorHAnsi"/>
-          <w:sz w:val="52"/>
-          <w:szCs w:val="52"/>
-        </w:rPr>
-      </w:pPr>
-    </w:p>
-    <w:p>
-      <w:pPr>
-        <w:jc w:val="center"/>
-        <w:rPr>
-          <w:rFonts w:ascii="Century Gothic" w:hAnsi="Century Gothic" w:cstheme="majorHAnsi"/>
         </w:rPr>
       </w:pPr>
     </w:p>
@@ -272,7 +264,7 @@
           <w:sz w:val="28"/>
           <w:szCs w:val="28"/>
         </w:rPr>
-        <w:t xml:space="preserve">Bogotá, 10 de octubre de 2026</w:t>
+        <w:t>Bogotá, 10 de octubre de 2026</w:t>
       </w:r>
     </w:p>
     <w:p>
@@ -466,7 +458,7 @@
                 <w:sz w:val="17"/>
                 <w:szCs w:val="17"/>
               </w:rPr>
-              <w:t xml:space="preserve">Versión</w:t>
+              <w:t>Versión</w:t>
             </w:r>
           </w:p>
         </w:tc>
@@ -496,7 +488,7 @@
                 <w:sz w:val="17"/>
                 <w:szCs w:val="17"/>
               </w:rPr>
-              <w:t xml:space="preserve">1.1 – Ajuste: última compra confirmada (1.0: 1 de octubre de 2026)</w:t>
+              <w:t>1.1 – Ajuste: última compra confirmada (1.0: 1 de octubre de 2026)</w:t>
             </w:r>
           </w:p>
         </w:tc>
@@ -528,7 +520,7 @@
                 <w:sz w:val="17"/>
                 <w:szCs w:val="17"/>
               </w:rPr>
-              <w:t xml:space="preserve">Fecha</w:t>
+              <w:t>Fecha</w:t>
             </w:r>
           </w:p>
         </w:tc>
@@ -558,7 +550,7 @@
                 <w:sz w:val="17"/>
                 <w:szCs w:val="17"/>
               </w:rPr>
-              <w:t xml:space="preserve">10 de octubre de 2026</w:t>
+              <w:t>10 de octubre de 2026</w:t>
             </w:r>
           </w:p>
         </w:tc>
@@ -744,15 +736,7 @@
                 <w:sz w:val="17"/>
                 <w:szCs w:val="17"/>
               </w:rPr>
-              <w:t>Manual Técnico – Inventario del Artíc</w:t>
-            </w:r>
-            <w:r>
-              <w:rPr>
-                <w:rFonts w:ascii="Century Gothic" w:eastAsia="Century Gothic" w:hAnsi="Century Gothic" w:cs="Century Gothic"/>
-                <w:sz w:val="17"/>
-                <w:szCs w:val="17"/>
-              </w:rPr>
-              <w:t>ulo en la Alarma de Cantidades Mínimas</w:t>
+              <w:t>Manual Técnico – Inventario del Artículo en la Alarma de Cantidades Mínimas</w:t>
             </w:r>
           </w:p>
         </w:tc>
@@ -798,10 +782,7 @@
         <w:t>correo periódico</w:t>
       </w:r>
       <w:r>
-        <w:t xml:space="preserve"> </w:t>
-      </w:r>
-      <w:r>
-        <w:t>de cantidades mínimas.</w:t>
+        <w:t xml:space="preserve"> de cantidades mínimas.</w:t>
       </w:r>
     </w:p>
     <w:p>
@@ -825,7 +806,7 @@
           <w:b/>
           <w:bCs/>
         </w:rPr>
-        <w:t xml:space="preserve">Versión 1.1:</w:t>
+        <w:t>Versión 1.1:</w:t>
       </w:r>
       <w:r>
         <w:t xml:space="preserve"> además del inventario, cada referencia muestra los datos de su </w:t>
@@ -835,10 +816,10 @@
           <w:b/>
           <w:bCs/>
         </w:rPr>
-        <w:t xml:space="preserve">última compra confirmada</w:t>
-      </w:r>
-      <w:r>
-        <w:t xml:space="preserve">: a quién se le compró, cuándo se hizo la orden de compra, cuándo se recibió y cuánto se pidió y se recibió. Así, al ver una alarma, se sabe de inmediato a qué proveedor acudir para reabastecer.</w:t>
+        <w:t>última compra confirmada</w:t>
+      </w:r>
+      <w:r>
+        <w:t>: a quién se le compró, cuándo se hizo la orden de compra, cuándo se recibió y cuánto se pidió y se recibió. Así, al ver una alarma, se sabe de inmediato a qué proveedor acudir para reabastecer.</w:t>
       </w:r>
     </w:p>
     <w:p>
@@ -868,10 +849,7 @@
         <w:t>Tablero de notificaciones</w:t>
       </w:r>
       <w:r>
-        <w:t xml:space="preserve"> y abra la band</w:t>
-      </w:r>
-      <w:r>
-        <w:t xml:space="preserve">eja </w:t>
+        <w:t xml:space="preserve"> y abra la bandeja </w:t>
       </w:r>
       <w:r>
         <w:rPr>
@@ -935,10 +913,7 @@
         <w:t>inventario de todas sus referencias activas</w:t>
       </w:r>
       <w:r>
-        <w:t>. La referencia de la alar</w:t>
-      </w:r>
-      <w:r>
-        <w:t xml:space="preserve">ma aparece </w:t>
+        <w:t xml:space="preserve">. La referencia de la alarma aparece </w:t>
       </w:r>
       <w:r>
         <w:rPr>
@@ -967,10 +942,10 @@
           <w:b/>
           <w:bCs/>
         </w:rPr>
-        <w:t xml:space="preserve">Proveedor última compra</w:t>
-      </w:r>
-      <w:r>
-        <w:t xml:space="preserve">, pase el cursor sobre el nombre del proveedor para ver la fecha de la orden de compra, la fecha real de recibo y las cantidades solicitada y recibida.</w:t>
+        <w:t>Proveedor última compra</w:t>
+      </w:r>
+      <w:r>
+        <w:t>, pase el cursor sobre el nombre del proveedor para ver la fecha de la orden de compra, la fecha real de recibo y las cantidades solicitada y recibida.</w:t>
       </w:r>
     </w:p>
     <w:p>
@@ -1014,7 +989,7 @@
         </w:numPr>
       </w:pPr>
       <w:r>
-        <w:t xml:space="preserve">Al desplegar el "+" del Excel, cada referencia trae también el proveedor, las fechas y las cantidades de su última compra confirmada.</w:t>
+        <w:t>Al desplegar el "+" del Excel, cada referencia trae también el proveedor, las fechas y las cantidades de su última compra confirmada.</w:t>
       </w:r>
     </w:p>
     <w:p>
@@ -1022,6 +997,7 @@
         <w:pStyle w:val="Ttulo1"/>
       </w:pPr>
       <w:r>
+        <w:lastRenderedPageBreak/>
         <w:t>3. INVENTARIO DEL ARTÍCULO EN EL TABLERO</w:t>
       </w:r>
     </w:p>
@@ -1042,14 +1018,7 @@
           <w:b/>
           <w:bCs/>
         </w:rPr>
-        <w:t>Sobrep</w:t>
-      </w:r>
-      <w:r>
-        <w:rPr>
-          <w:b/>
-          <w:bCs/>
-        </w:rPr>
-        <w:t>aso de cantidades mínimas por referencia</w:t>
+        <w:t>Sobrepaso de cantidades mínimas por referencia</w:t>
       </w:r>
       <w:r>
         <w:t xml:space="preserve">, cada alarma tiene a la izquierda un botón con el ícono de imagen. Al pasar el mouse muestra el texto </w:t>
@@ -1075,7 +1044,6 @@
           <w:noProof/>
           <w:lang w:eastAsia="es-CO"/>
         </w:rPr>
-        <w:lastRenderedPageBreak/>
         <w:drawing>
           <wp:inline distT="0" distB="0" distL="0" distR="0">
             <wp:extent cx="5715000" cy="2828925"/>
@@ -1129,17 +1097,7 @@
           <w:sz w:val="17"/>
           <w:szCs w:val="17"/>
         </w:rPr>
-        <w:t>Figura 1. Bandeja "Sobrepaso de cantidades mínimas por referencia"</w:t>
-      </w:r>
-      <w:r>
-        <w:rPr>
-          <w:i/>
-          <w:iCs/>
-          <w:color w:val="595959"/>
-          <w:sz w:val="17"/>
-          <w:szCs w:val="17"/>
-        </w:rPr>
-        <w:t xml:space="preserve"> y botón de imagen de la alarma.</w:t>
+        <w:t>Figura 1. Bandeja "Sobrepaso de cantidades mínimas por referencia" y botón de imagen de la alarma.</w:t>
       </w:r>
     </w:p>
     <w:p>
@@ -1199,10 +1157,7 @@
         <w:t>Arriba:</w:t>
       </w:r>
       <w:r>
-        <w:t xml:space="preserve"> el nombre del artícul</w:t>
-      </w:r>
-      <w:r>
-        <w:t xml:space="preserve">o con la referencia de la alarma y la </w:t>
+        <w:t xml:space="preserve"> el nombre del artículo con la referencia de la alarma y la </w:t>
       </w:r>
       <w:r>
         <w:rPr>
@@ -1241,10 +1196,7 @@
         <w:t>Inventario del artículo (referencias activas)</w:t>
       </w:r>
       <w:r>
-        <w:t>, con una fila por cada referencia</w:t>
-      </w:r>
-      <w:r>
-        <w:t xml:space="preserve"> activa del artículo, ordenadas por nombre.</w:t>
+        <w:t>, con una fila por cada referencia activa del artículo, ordenadas por nombre.</w:t>
       </w:r>
     </w:p>
     <w:p>
@@ -1295,10 +1247,10 @@
           <w:b/>
           <w:bCs/>
         </w:rPr>
-        <w:t xml:space="preserve">Proveedor última compra</w:t>
-      </w:r>
-      <w:r>
-        <w:t xml:space="preserve">, muestra el proveedor de la última orden de compra confirmada de cada referencia.</w:t>
+        <w:t>Proveedor última compra</w:t>
+      </w:r>
+      <w:r>
+        <w:t>, muestra el proveedor de la última orden de compra confirmada de cada referencia.</w:t>
       </w:r>
     </w:p>
     <w:p>
@@ -1443,17 +1395,7 @@
           <w:sz w:val="17"/>
           <w:szCs w:val="17"/>
         </w:rPr>
-        <w:t>Fi</w:t>
-      </w:r>
-      <w:r>
-        <w:rPr>
-          <w:i/>
-          <w:iCs/>
-          <w:color w:val="595959"/>
-          <w:sz w:val="17"/>
-          <w:szCs w:val="17"/>
-        </w:rPr>
-        <w:t>gura 3. Artículo sin imagen: la tabla se muestra igual. La fila resaltada es la referencia de la alarma.</w:t>
+        <w:t>Figura 3. Artículo sin imagen: la tabla se muestra igual. La fila resaltada es la referencia de la alarma.</w:t>
       </w:r>
     </w:p>
     <w:p>
@@ -2090,7 +2032,7 @@
                 <w:sz w:val="17"/>
                 <w:szCs w:val="17"/>
               </w:rPr>
-              <w:t xml:space="preserve">Proveedor última compra</w:t>
+              <w:t>Proveedor última compra</w:t>
             </w:r>
           </w:p>
         </w:tc>
@@ -2120,7 +2062,7 @@
                 <w:sz w:val="17"/>
                 <w:szCs w:val="17"/>
               </w:rPr>
-              <w:t xml:space="preserve">Proveedor de la última orden de compra confirmada de la referencia (la que afectó el inventario). Vacío si la referencia no tiene órdenes de compra confirmadas. Pase el cursor para ver el detalle (sección 3.4).</w:t>
+              <w:t>Proveedor de la última orden de compra confirmada de la referencia (la que afectó el inventario). Vacío si la referencia no tiene órdenes de compra confirmadas. Pase el cursor para ver el detalle (sección 3.4).</w:t>
             </w:r>
           </w:p>
         </w:tc>
@@ -2154,7 +2096,7 @@
         <w:pStyle w:val="Ttulo2"/>
       </w:pPr>
       <w:r>
-        <w:t xml:space="preserve">3.4 Última compra confirmada</w:t>
+        <w:t>3.4 Última compra confirmada</w:t>
       </w:r>
     </w:p>
     <w:p>
@@ -2166,7 +2108,7 @@
           <w:b/>
           <w:bCs/>
         </w:rPr>
-        <w:t xml:space="preserve">Proveedor última compra</w:t>
+        <w:t>Proveedor última compra</w:t>
       </w:r>
       <w:r>
         <w:t xml:space="preserve"> muestra a quién se le compró por última vez cada referencia. Al pasar el cursor sobre el nombre del proveedor aparece un recuadro con el detalle de esa compra:</w:t>
@@ -2185,7 +2127,7 @@
           <w:b/>
           <w:bCs/>
         </w:rPr>
-        <w:t xml:space="preserve">Proveedor:</w:t>
+        <w:t>Proveedor:</w:t>
       </w:r>
       <w:r>
         <w:t xml:space="preserve"> nombre completo del proveedor.</w:t>
@@ -2204,7 +2146,7 @@
           <w:b/>
           <w:bCs/>
         </w:rPr>
-        <w:t xml:space="preserve">Fecha OC:</w:t>
+        <w:t>Fecha OC:</w:t>
       </w:r>
       <w:r>
         <w:t xml:space="preserve"> fecha de la orden de compra.</w:t>
@@ -2223,7 +2165,7 @@
           <w:b/>
           <w:bCs/>
         </w:rPr>
-        <w:t xml:space="preserve">Fecha real de recibo:</w:t>
+        <w:t>Fecha real de recibo:</w:t>
       </w:r>
       <w:r>
         <w:t xml:space="preserve"> fecha en que se recibió la mercancía.</w:t>
@@ -2242,7 +2184,7 @@
           <w:b/>
           <w:bCs/>
         </w:rPr>
-        <w:t xml:space="preserve">Cantidad solicitada</w:t>
+        <w:t>Cantidad solicitada</w:t>
       </w:r>
       <w:r>
         <w:t xml:space="preserve"> y </w:t>
@@ -2252,7 +2194,7 @@
           <w:b/>
           <w:bCs/>
         </w:rPr>
-        <w:t xml:space="preserve">Cantidad recibida</w:t>
+        <w:t>Cantidad recibida</w:t>
       </w:r>
       <w:r>
         <w:t xml:space="preserve"> de esa referencia en la orden de compra.</w:t>
@@ -2286,7 +2228,7 @@
                     </pic:cNvPicPr>
                   </pic:nvPicPr>
                   <pic:blipFill>
-                    <a:blip r:embed="rId90"/>
+                    <a:blip r:embed="rId11"/>
                     <a:srcRect/>
                     <a:stretch>
                       <a:fillRect/>
@@ -2321,7 +2263,7 @@
           <w:sz w:val="17"/>
           <w:szCs w:val="17"/>
         </w:rPr>
-        <w:t xml:space="preserve">Figura 4. Datos de la última compra confirmada al pasar el cursor sobre el proveedor. La referencia Rojo (la de la alarma) no tiene compras confirmadas y su proveedor aparece vacío.</w:t>
+        <w:t>Figura 4. Datos de la última compra confirmada al pasar el cursor sobre el proveedor. La referencia Rojo (la de la alarma) no tiene compras confirmadas y su proveedor aparece vacío.</w:t>
       </w:r>
     </w:p>
     <w:p>
@@ -2341,7 +2283,7 @@
           <w:b/>
           <w:bCs/>
         </w:rPr>
-        <w:t xml:space="preserve">Confirmada</w:t>
+        <w:t>Confirmada</w:t>
       </w:r>
       <w:r>
         <w:t xml:space="preserve"> (la que ya afectó el inventario) con la fecha real de recibo más reciente. Las órdenes Pendientes, En aprobación o Canceladas no se tienen en cuenta. Si la referencia no tiene órdenes de compra confirmadas, la columna queda vacía.</w:t>
@@ -2352,6 +2294,7 @@
         <w:pStyle w:val="Ttulo2"/>
       </w:pPr>
       <w:r>
+        <w:lastRenderedPageBreak/>
         <w:t>3.5 Coherencia con la bandeja</w:t>
       </w:r>
     </w:p>
@@ -2744,10 +2687,7 @@
     </w:p>
     <w:p>
       <w:r>
-        <w:t>Los usuarios con el rol de notificación de c</w:t>
-      </w:r>
-      <w:r>
-        <w:t xml:space="preserve">antidades mínimas reciben periódicamente un correo con el archivo </w:t>
+        <w:t xml:space="preserve">Los usuarios con el rol de notificación de cantidades mínimas reciben periódicamente un correo con el archivo </w:t>
       </w:r>
       <w:r>
         <w:rPr>
@@ -2804,14 +2744,7 @@
           <w:b/>
           <w:bCs/>
         </w:rPr>
-        <w:t>E</w:t>
-      </w:r>
-      <w:r>
-        <w:rPr>
-          <w:b/>
-          <w:bCs/>
-        </w:rPr>
-        <w:t>n alarma</w:t>
+        <w:t>En alarma</w:t>
       </w:r>
       <w:r>
         <w:t xml:space="preserve">, su </w:t>
@@ -2898,77 +2831,7 @@
         <w:t>2</w:t>
       </w:r>
       <w:r>
-        <w:t xml:space="preserve"> de la </w:t>
-      </w:r>
-      <w:r>
-        <w:t>esquina superior izquierda contraen o despliegan todos los grupos a la vez.</w:t>
-      </w:r>
-    </w:p>
-    <w:p>
-      <w:pPr>
-        <w:spacing w:after="40"/>
-        <w:jc w:val="center"/>
-      </w:pPr>
-      <w:r>
-        <w:rPr>
-          <w:noProof/>
-          <w:lang w:eastAsia="es-CO"/>
-        </w:rPr>
-        <w:lastRenderedPageBreak/>
-        <w:drawing>
-          <wp:inline distT="0" distB="0" distL="0" distR="0">
-            <wp:extent cx="5715000" cy="2638425"/>
-            <wp:effectExtent l="0" t="0" r="0" b="0"/>
-            <wp:docPr id="4" name="Imagen 4"/>
-            <wp:cNvGraphicFramePr>
-              <a:graphicFrameLocks xmlns:a="http://schemas.openxmlformats.org/drawingml/2006/main" noChangeAspect="1"/>
-            </wp:cNvGraphicFramePr>
-            <a:graphic xmlns:a="http://schemas.openxmlformats.org/drawingml/2006/main">
-              <a:graphicData uri="http://schemas.openxmlformats.org/drawingml/2006/picture">
-                <pic:pic xmlns:pic="http://schemas.openxmlformats.org/drawingml/2006/picture">
-                  <pic:nvPicPr>
-                    <pic:cNvPr id="0" name=""/>
-                    <pic:cNvPicPr>
-                      <a:picLocks noChangeAspect="1" noChangeArrowheads="1"/>
-                    </pic:cNvPicPr>
-                  </pic:nvPicPr>
-                  <pic:blipFill>
-                    <a:blip r:embed="rId11"/>
-                    <a:srcRect/>
-                    <a:stretch>
-                      <a:fillRect/>
-                    </a:stretch>
-                  </pic:blipFill>
-                  <pic:spPr bwMode="auto">
-                    <a:xfrm>
-                      <a:off x="0" y="0"/>
-                      <a:ext cx="5715000" cy="2638425"/>
-                    </a:xfrm>
-                    <a:prstGeom prst="rect">
-                      <a:avLst/>
-                    </a:prstGeom>
-                  </pic:spPr>
-                </pic:pic>
-              </a:graphicData>
-            </a:graphic>
-          </wp:inline>
-        </w:drawing>
-      </w:r>
-    </w:p>
-    <w:p>
-      <w:pPr>
-        <w:spacing w:after="160"/>
-        <w:jc w:val="center"/>
-      </w:pPr>
-      <w:r>
-        <w:rPr>
-          <w:i/>
-          <w:iCs/>
-          <w:color w:val="595959"/>
-          <w:sz w:val="17"/>
-          <w:szCs w:val="17"/>
-        </w:rPr>
-        <w:t>Figura 5. Excel del correo con los grupos contraídos: una fila por alarma, con la imagen del artículo (en Excel cada fila tiene su "+" a la izquierda).</w:t>
+        <w:t xml:space="preserve"> de la esquina superior izquierda contraen o despliegan todos los grupos a la vez.</w:t>
       </w:r>
     </w:p>
     <w:p>
@@ -2983,9 +2846,9 @@
         </w:rPr>
         <w:drawing>
           <wp:inline distT="0" distB="0" distL="0" distR="0">
-            <wp:extent cx="5715000" cy="1247775"/>
+            <wp:extent cx="5715000" cy="2638425"/>
             <wp:effectExtent l="0" t="0" r="0" b="0"/>
-            <wp:docPr id="5" name="Imagen 5"/>
+            <wp:docPr id="4" name="Imagen 4"/>
             <wp:cNvGraphicFramePr>
               <a:graphicFrameLocks xmlns:a="http://schemas.openxmlformats.org/drawingml/2006/main" noChangeAspect="1"/>
             </wp:cNvGraphicFramePr>
@@ -3008,6 +2871,73 @@
                   <pic:spPr bwMode="auto">
                     <a:xfrm>
                       <a:off x="0" y="0"/>
+                      <a:ext cx="5715000" cy="2638425"/>
+                    </a:xfrm>
+                    <a:prstGeom prst="rect">
+                      <a:avLst/>
+                    </a:prstGeom>
+                  </pic:spPr>
+                </pic:pic>
+              </a:graphicData>
+            </a:graphic>
+          </wp:inline>
+        </w:drawing>
+      </w:r>
+    </w:p>
+    <w:p>
+      <w:pPr>
+        <w:spacing w:after="160"/>
+        <w:jc w:val="center"/>
+      </w:pPr>
+      <w:r>
+        <w:rPr>
+          <w:i/>
+          <w:iCs/>
+          <w:color w:val="595959"/>
+          <w:sz w:val="17"/>
+          <w:szCs w:val="17"/>
+        </w:rPr>
+        <w:t>Figura 5. Excel del correo con los grupos contraídos: una fila por alarma, con la imagen del artículo (en Excel cada fila tiene su "+" a la izquierda).</w:t>
+      </w:r>
+    </w:p>
+    <w:p>
+      <w:pPr>
+        <w:spacing w:after="40"/>
+        <w:jc w:val="center"/>
+      </w:pPr>
+      <w:r>
+        <w:rPr>
+          <w:noProof/>
+          <w:lang w:eastAsia="es-CO"/>
+        </w:rPr>
+        <w:lastRenderedPageBreak/>
+        <w:drawing>
+          <wp:inline distT="0" distB="0" distL="0" distR="0">
+            <wp:extent cx="5715000" cy="1247775"/>
+            <wp:effectExtent l="0" t="0" r="0" b="0"/>
+            <wp:docPr id="5" name="Imagen 5"/>
+            <wp:cNvGraphicFramePr>
+              <a:graphicFrameLocks xmlns:a="http://schemas.openxmlformats.org/drawingml/2006/main" noChangeAspect="1"/>
+            </wp:cNvGraphicFramePr>
+            <a:graphic xmlns:a="http://schemas.openxmlformats.org/drawingml/2006/main">
+              <a:graphicData uri="http://schemas.openxmlformats.org/drawingml/2006/picture">
+                <pic:pic xmlns:pic="http://schemas.openxmlformats.org/drawingml/2006/picture">
+                  <pic:nvPicPr>
+                    <pic:cNvPr id="0" name=""/>
+                    <pic:cNvPicPr>
+                      <a:picLocks noChangeAspect="1" noChangeArrowheads="1"/>
+                    </pic:cNvPicPr>
+                  </pic:nvPicPr>
+                  <pic:blipFill>
+                    <a:blip r:embed="rId13"/>
+                    <a:srcRect/>
+                    <a:stretch>
+                      <a:fillRect/>
+                    </a:stretch>
+                  </pic:blipFill>
+                  <pic:spPr bwMode="auto">
+                    <a:xfrm>
+                      <a:off x="0" y="0"/>
                       <a:ext cx="5715000" cy="1247775"/>
                     </a:xfrm>
                     <a:prstGeom prst="rect">
@@ -3047,10 +2977,7 @@
     </w:p>
     <w:p>
       <w:r>
-        <w:t>Artículo / Referencia · Imagen · En alarma · Cantidad mínima · Bodega Local · Zona Franca · Stock Físico · En tránsito · Com</w:t>
-      </w:r>
-      <w:r>
-        <w:t xml:space="preserve">prometido · Disponible. Las cifras y fórmulas son </w:t>
+        <w:t xml:space="preserve">Artículo / Referencia · Imagen · En alarma · Cantidad mínima · Bodega Local · Zona Franca · Stock Físico · En tránsito · Comprometido · Disponible. Las cifras y fórmulas son </w:t>
       </w:r>
       <w:r>
         <w:rPr>
@@ -3110,7 +3037,7 @@
           <w:b/>
           <w:bCs/>
         </w:rPr>
-        <w:t xml:space="preserve">Versión 1.1:</w:t>
+        <w:t>Versión 1.1:</w:t>
       </w:r>
       <w:r>
         <w:t xml:space="preserve"> al final se agregan las columnas </w:t>
@@ -3120,10 +3047,10 @@
           <w:b/>
           <w:bCs/>
         </w:rPr>
-        <w:t xml:space="preserve">Proveedor última compra · Fecha OC · Fecha real de recibo · Cantidad solicitada · Cantidad recibida</w:t>
-      </w:r>
-      <w:r>
-        <w:t xml:space="preserve">, con la última compra confirmada de cada referencia (mismo criterio de la sección 3.4). Se llenan solo en las filas del detalle, al desplegar el "+"; en la fila de la alarma quedan vacías porque esa referencia ya aparece en el detalle.</w:t>
+        <w:t>Proveedor última compra · Fecha OC · Fecha real de recibo · Cantidad solicitada · Cantidad recibida</w:t>
+      </w:r>
+      <w:r>
+        <w:t>, con la última compra confirmada de cada referencia (mismo criterio de la sección 3.4). Se llenan solo en las filas del detalle, al desplegar el "+"; en la fila de la alarma quedan vacías porque esa referencia ya aparece en el detalle.</w:t>
       </w:r>
     </w:p>
     <w:p>
@@ -3154,7 +3081,7 @@
                     </pic:cNvPicPr>
                   </pic:nvPicPr>
                   <pic:blipFill>
-                    <a:blip r:embed="rId91"/>
+                    <a:blip r:embed="rId14"/>
                     <a:srcRect/>
                     <a:stretch>
                       <a:fillRect/>
@@ -3189,7 +3116,7 @@
           <w:sz w:val="17"/>
           <w:szCs w:val="17"/>
         </w:rPr>
-        <w:t xml:space="preserve">Figura 7. Grupo de ASHBY desplegado: Azul, Blanco y Negro muestran su última compra confirmada; Gris Oscuro (en alarma) no tiene compras confirmadas.</w:t>
+        <w:t>Figura 7. Grupo de ASHBY desplegado: Azul, Blanco y Negro muestran su última compra confirmada; Gris Oscuro (en alarma) no tiene compras confirmadas.</w:t>
       </w:r>
     </w:p>
     <w:p>
@@ -3197,10 +3124,7 @@
         <w:pStyle w:val="Ttulo2"/>
       </w:pPr>
       <w:r>
-        <w:t>4.3 Artículos con varias alar</w:t>
-      </w:r>
-      <w:r>
-        <w:t>mas</w:t>
+        <w:t>4.3 Artículos con varias alarmas</w:t>
       </w:r>
     </w:p>
     <w:p>
@@ -3258,10 +3182,7 @@
         <w:t>"Marcar alarmas como leídas"</w:t>
       </w:r>
       <w:r>
-        <w:t xml:space="preserve"> d</w:t>
-      </w:r>
-      <w:r>
-        <w:t xml:space="preserve">el correo sigue funcionando igual: marca como leídas </w:t>
+        <w:t xml:space="preserve"> del correo sigue funcionando igual: marca como leídas </w:t>
       </w:r>
       <w:r>
         <w:rPr>
@@ -3282,8 +3203,6 @@
         <w:lastRenderedPageBreak/>
         <w:t>5</w:t>
       </w:r>
-      <w:bookmarkStart w:id="0" w:name="_GoBack"/>
-      <w:bookmarkEnd w:id="0"/>
       <w:r>
         <w:t>. PREGUNTAS FRECUENTES</w:t>
       </w:r>
@@ -3623,15 +3542,7 @@
                 <w:sz w:val="17"/>
                 <w:szCs w:val="17"/>
               </w:rPr>
-              <w:t>No. Este cambio aplica solo a "Sobrepa</w:t>
-            </w:r>
-            <w:r>
-              <w:rPr>
-                <w:rFonts w:ascii="Century Gothic" w:eastAsia="Century Gothic" w:hAnsi="Century Gothic" w:cs="Century Gothic"/>
-                <w:sz w:val="17"/>
-                <w:szCs w:val="17"/>
-              </w:rPr>
-              <w:t>so de cantidades mínimas por referencia". Las demás bandejas siguen mostrando solo la imagen.</w:t>
+              <w:t>No. Este cambio aplica solo a "Sobrepaso de cantidades mínimas por referencia". Las demás bandejas siguen mostrando solo la imagen.</w:t>
             </w:r>
           </w:p>
         </w:tc>
@@ -3725,7 +3636,7 @@
                 <w:sz w:val="17"/>
                 <w:szCs w:val="17"/>
               </w:rPr>
-              <w:t xml:space="preserve">¿Qué orden de compra se toma como "última compra"?</w:t>
+              <w:t>¿Qué orden de compra se toma como "última compra"?</w:t>
             </w:r>
           </w:p>
         </w:tc>
@@ -3755,7 +3666,7 @@
                 <w:sz w:val="17"/>
                 <w:szCs w:val="17"/>
               </w:rPr>
-              <w:t xml:space="preserve">La orden de compra en estado Confirmada, con la fecha real de recibo más reciente, que incluye la referencia. Las órdenes Pendientes, En aprobación o Canceladas no se tienen en cuenta.</w:t>
+              <w:t>La orden de compra en estado Confirmada, con la fecha real de recibo más reciente, que incluye la referencia. Las órdenes Pendientes, En aprobación o Canceladas no se tienen en cuenta.</w:t>
             </w:r>
           </w:p>
         </w:tc>
@@ -3787,7 +3698,7 @@
                 <w:sz w:val="17"/>
                 <w:szCs w:val="17"/>
               </w:rPr>
-              <w:t xml:space="preserve">¿Por qué el proveedor aparece vacío?</w:t>
+              <w:t>¿Por qué el proveedor aparece vacío?</w:t>
             </w:r>
           </w:p>
         </w:tc>
@@ -3817,7 +3728,7 @@
                 <w:sz w:val="17"/>
                 <w:szCs w:val="17"/>
               </w:rPr>
-              <w:t xml:space="preserve">La referencia no tiene órdenes de compra confirmadas.</w:t>
+              <w:t>La referencia no tiene órdenes de compra confirmadas.</w:t>
             </w:r>
           </w:p>
         </w:tc>
@@ -3849,7 +3760,7 @@
                 <w:sz w:val="17"/>
                 <w:szCs w:val="17"/>
               </w:rPr>
-              <w:t xml:space="preserve">Varias referencias muestran el mismo proveedor y fechas.</w:t>
+              <w:t>Varias referencias muestran el mismo proveedor y fechas.</w:t>
             </w:r>
           </w:p>
         </w:tc>
@@ -3879,7 +3790,7 @@
                 <w:sz w:val="17"/>
                 <w:szCs w:val="17"/>
               </w:rPr>
-              <w:t xml:space="preserve">Es normal: se compraron en la misma orden de compra. Las cantidades sí son las de cada referencia.</w:t>
+              <w:t>Es normal: se compraron en la misma orden de compra. Las cantidades sí son las de cada referencia.</w:t>
             </w:r>
           </w:p>
         </w:tc>
@@ -3887,8 +3798,8 @@
     </w:tbl>
     <w:p/>
     <w:sectPr>
-      <w:headerReference w:type="even" r:id="rId13"/>
-      <w:headerReference w:type="first" r:id="rId14"/>
+      <w:headerReference w:type="even" r:id="rId15"/>
+      <w:headerReference w:type="first" r:id="rId16"/>
       <w:pgSz w:w="12240" w:h="15840" w:code="1"/>
       <w:pgMar w:top="1440" w:right="1440" w:bottom="1440" w:left="1440" w:header="709" w:footer="709" w:gutter="0"/>
       <w:cols w:space="708"/>
@@ -3977,7 +3888,7 @@
               <wp:docPr id="1842129993" name="Cuadro de texto 4" descr="• PUBLIC 公開">
                 <a:extLst xmlns:a="http://schemas.openxmlformats.org/drawingml/2006/main">
                   <a:ext uri="{5AE41FA2-C0FF-4470-9BD4-5FADCA87CBE2}">
-                    <aclsh:classification xmlns="" xmlns:cx="http://schemas.microsoft.com/office/drawing/2014/chartex" xmlns:cx1="http://schemas.microsoft.com/office/drawing/2015/9/8/chartex" xmlns:cx2="http://schemas.microsoft.com/office/drawing/2015/10/21/chartex" xmlns:cx3="http://schemas.microsoft.com/office/drawing/2016/5/9/chartex" xmlns:cx4="http://schemas.microsoft.com/office/drawing/2016/5/10/chartex" xmlns:cx5="http://schemas.microsoft.com/office/drawing/2016/5/11/chartex" xmlns:cx6="http://schemas.microsoft.com/office/drawing/2016/5/12/chartex" xmlns:cx7="http://schemas.microsoft.com/office/drawing/2016/5/13/chartex" xmlns:cx8="http://schemas.microsoft.com/office/drawing/2016/5/14/chartex" xmlns:aink="http://schemas.microsoft.com/office/drawing/2016/ink" xmlns:am3d="http://schemas.microsoft.com/office/drawing/2017/model3d" xmlns:o="urn:schemas-microsoft-com:office:office" xmlns:oel="http://schemas.microsoft.com/office/2019/extlst" xmlns:v="urn:schemas-microsoft-com:vml" xmlns:w10="urn:schemas-microsoft-com:office:word" xmlns:w="http://schemas.openxmlformats.org/wordprocessingml/2006/main" xmlns:w16cex="http://schemas.microsoft.com/office/word/2018/wordml/cex" xmlns:w16cid="http://schemas.microsoft.com/office/word/2016/wordml/cid" xmlns:w16="http://schemas.microsoft.com/office/word/2018/wordml" xmlns:w16du="http://schemas.microsoft.com/office/word/2023/wordml/word16du" xmlns:w16sdtdh="http://schemas.microsoft.com/office/word/2020/wordml/sdtdatahash" xmlns:w16sdtfl="http://schemas.microsoft.com/office/word/2024/wordml/sdtformatlock" xmlns:w16se="http://schemas.microsoft.com/office/word/2015/wordml/symex" xmlns:aclsh="http://schemas.microsoft.com/office/drawing/2020/classificationShape" classificationOutcomeType="hdr"/>
+                    <aclsh:classification xmlns:aclsh="http://schemas.microsoft.com/office/drawing/2020/classificationShape" xmlns:w16se="http://schemas.microsoft.com/office/word/2015/wordml/symex" xmlns:w16sdtfl="http://schemas.microsoft.com/office/word/2024/wordml/sdtformatlock" xmlns:w16sdtdh="http://schemas.microsoft.com/office/word/2020/wordml/sdtdatahash" xmlns:w16du="http://schemas.microsoft.com/office/word/2023/wordml/word16du" xmlns:w16="http://schemas.microsoft.com/office/word/2018/wordml" xmlns:w16cid="http://schemas.microsoft.com/office/word/2016/wordml/cid" xmlns:w16cex="http://schemas.microsoft.com/office/word/2018/wordml/cex" xmlns:w="http://schemas.openxmlformats.org/wordprocessingml/2006/main" xmlns:w10="urn:schemas-microsoft-com:office:word" xmlns:v="urn:schemas-microsoft-com:vml" xmlns:oel="http://schemas.microsoft.com/office/2019/extlst" xmlns:o="urn:schemas-microsoft-com:office:office" xmlns:am3d="http://schemas.microsoft.com/office/drawing/2017/model3d" xmlns:aink="http://schemas.microsoft.com/office/drawing/2016/ink" xmlns:cx8="http://schemas.microsoft.com/office/drawing/2016/5/14/chartex" xmlns:cx7="http://schemas.microsoft.com/office/drawing/2016/5/13/chartex" xmlns:cx6="http://schemas.microsoft.com/office/drawing/2016/5/12/chartex" xmlns:cx5="http://schemas.microsoft.com/office/drawing/2016/5/11/chartex" xmlns:cx4="http://schemas.microsoft.com/office/drawing/2016/5/10/chartex" xmlns:cx3="http://schemas.microsoft.com/office/drawing/2016/5/9/chartex" xmlns:cx2="http://schemas.microsoft.com/office/drawing/2015/10/21/chartex" xmlns:cx1="http://schemas.microsoft.com/office/drawing/2015/9/8/chartex" xmlns:cx="http://schemas.microsoft.com/office/drawing/2014/chartex" xmlns="" classificationOutcomeType="hdr"/>
                   </a:ext>
                 </a:extLst>
               </wp:docPr>
@@ -4109,7 +4020,7 @@
               <wp:docPr id="397844938" name="Cuadro de texto 3" descr="• PUBLIC 公開">
                 <a:extLst xmlns:a="http://schemas.openxmlformats.org/drawingml/2006/main">
                   <a:ext uri="{5AE41FA2-C0FF-4470-9BD4-5FADCA87CBE2}">
-                    <aclsh:classification xmlns="" xmlns:cx="http://schemas.microsoft.com/office/drawing/2014/chartex" xmlns:cx1="http://schemas.microsoft.com/office/drawing/2015/9/8/chartex" xmlns:cx2="http://schemas.microsoft.com/office/drawing/2015/10/21/chartex" xmlns:cx3="http://schemas.microsoft.com/office/drawing/2016/5/9/chartex" xmlns:cx4="http://schemas.microsoft.com/office/drawing/2016/5/10/chartex" xmlns:cx5="http://schemas.microsoft.com/office/drawing/2016/5/11/chartex" xmlns:cx6="http://schemas.microsoft.com/office/drawing/2016/5/12/chartex" xmlns:cx7="http://schemas.microsoft.com/office/drawing/2016/5/13/chartex" xmlns:cx8="http://schemas.microsoft.com/office/drawing/2016/5/14/chartex" xmlns:aink="http://schemas.microsoft.com/office/drawing/2016/ink" xmlns:am3d="http://schemas.microsoft.com/office/drawing/2017/model3d" xmlns:o="urn:schemas-microsoft-com:office:office" xmlns:oel="http://schemas.microsoft.com/office/2019/extlst" xmlns:v="urn:schemas-microsoft-com:vml" xmlns:w10="urn:schemas-microsoft-com:office:word" xmlns:w="http://schemas.openxmlformats.org/wordprocessingml/2006/main" xmlns:w16cex="http://schemas.microsoft.com/office/word/2018/wordml/cex" xmlns:w16cid="http://schemas.microsoft.com/office/word/2016/wordml/cid" xmlns:w16="http://schemas.microsoft.com/office/word/2018/wordml" xmlns:w16du="http://schemas.microsoft.com/office/word/2023/wordml/word16du" xmlns:w16sdtdh="http://schemas.microsoft.com/office/word/2020/wordml/sdtdatahash" xmlns:w16sdtfl="http://schemas.microsoft.com/office/word/2024/wordml/sdtformatlock" xmlns:w16se="http://schemas.microsoft.com/office/word/2015/wordml/symex" xmlns:aclsh="http://schemas.microsoft.com/office/drawing/2020/classificationShape" classificationOutcomeType="hdr"/>
+                    <aclsh:classification xmlns:aclsh="http://schemas.microsoft.com/office/drawing/2020/classificationShape" xmlns:w16se="http://schemas.microsoft.com/office/word/2015/wordml/symex" xmlns:w16sdtfl="http://schemas.microsoft.com/office/word/2024/wordml/sdtformatlock" xmlns:w16sdtdh="http://schemas.microsoft.com/office/word/2020/wordml/sdtdatahash" xmlns:w16du="http://schemas.microsoft.com/office/word/2023/wordml/word16du" xmlns:w16="http://schemas.microsoft.com/office/word/2018/wordml" xmlns:w16cid="http://schemas.microsoft.com/office/word/2016/wordml/cid" xmlns:w16cex="http://schemas.microsoft.com/office/word/2018/wordml/cex" xmlns:w="http://schemas.openxmlformats.org/wordprocessingml/2006/main" xmlns:w10="urn:schemas-microsoft-com:office:word" xmlns:v="urn:schemas-microsoft-com:vml" xmlns:oel="http://schemas.microsoft.com/office/2019/extlst" xmlns:o="urn:schemas-microsoft-com:office:office" xmlns:am3d="http://schemas.microsoft.com/office/drawing/2017/model3d" xmlns:aink="http://schemas.microsoft.com/office/drawing/2016/ink" xmlns:cx8="http://schemas.microsoft.com/office/drawing/2016/5/14/chartex" xmlns:cx7="http://schemas.microsoft.com/office/drawing/2016/5/13/chartex" xmlns:cx6="http://schemas.microsoft.com/office/drawing/2016/5/12/chartex" xmlns:cx5="http://schemas.microsoft.com/office/drawing/2016/5/11/chartex" xmlns:cx4="http://schemas.microsoft.com/office/drawing/2016/5/10/chartex" xmlns:cx3="http://schemas.microsoft.com/office/drawing/2016/5/9/chartex" xmlns:cx2="http://schemas.microsoft.com/office/drawing/2015/10/21/chartex" xmlns:cx1="http://schemas.microsoft.com/office/drawing/2015/9/8/chartex" xmlns:cx="http://schemas.microsoft.com/office/drawing/2014/chartex" xmlns="" classificationOutcomeType="hdr"/>
                   </a:ext>
                 </a:extLst>
               </wp:docPr>
@@ -11384,7 +11295,7 @@
 </file>
 
 <file path=customXml/itemProps1.xml><?xml version="1.0" encoding="utf-8"?>
-<ds:datastoreItem xmlns:ds="http://schemas.openxmlformats.org/officeDocument/2006/customXml" ds:itemID="{CB080A14-1D6B-417F-83B2-5FE16CE6FB8C}">
+<ds:datastoreItem xmlns:ds="http://schemas.openxmlformats.org/officeDocument/2006/customXml" ds:itemID="{448D3AC7-15F3-4C40-8A6F-8049F6AC7BA7}">
   <ds:schemaRefs>
     <ds:schemaRef ds:uri="http://schemas.openxmlformats.org/officeDocument/2006/bibliography"/>
   </ds:schemaRefs>

</xml_diff>